<commit_message>
feat: add PDF cadrage generation script and week 8 document while removing outdated report
</commit_message>
<xml_diff>
--- a/Messages/semaine8.docx
+++ b/Messages/semaine8.docx
@@ -26,10 +26,7 @@
         <w:t xml:space="preserve">normalement </w:t>
       </w:r>
       <w:r>
-        <w:t>programmée</w:t>
-      </w:r>
-      <w:r>
-        <w:t xml:space="preserve"> aujourd'hui, lundi 14 septembre. Comme les accès </w:t>
+        <w:t xml:space="preserve">programmée aujourd'hui, lundi 14 septembre. Comme les accès </w:t>
       </w:r>
       <w:r>
         <w:t>devraient s’activer</w:t>
@@ -49,10 +46,7 @@
         <w:t xml:space="preserve">mes </w:t>
       </w:r>
       <w:r>
-        <w:t>retours</w:t>
-      </w:r>
-      <w:r>
-        <w:t xml:space="preserve"> sur Moodle et réimportez vos devoirs pour débloquer votre situation. Enfin, pour tous ceux qui travaillent encore sur les Séquences</w:t>
+        <w:t>retours sur Moodle et réimportez vos devoirs pour débloquer votre situation. Enfin, pour tous ceux qui travaillent encore sur les Séquences</w:t>
       </w:r>
       <w:r>
         <w:t xml:space="preserve"> 1, 2,</w:t>
@@ -148,6 +142,12 @@
       </w:r>
     </w:p>
     <w:p>
+      <w:pPr>
+        <w:rPr>
+          <w:i/>
+          <w:iCs/>
+        </w:rPr>
+      </w:pPr>
       <w:r>
         <w:rPr>
           <w:i/>
@@ -156,6 +156,47 @@
         <w:t>Tuteur Marketing Numérique</w:t>
       </w:r>
     </w:p>
+    <w:p>
+      <w:pPr>
+        <w:rPr>
+          <w:i/>
+          <w:iCs/>
+        </w:rPr>
+      </w:pPr>
+    </w:p>
+    <w:p>
+      <w:r>
+        <w:t xml:space="preserve">Bonjour à toutes et à tous </w:t>
+      </w:r>
+      <w:r>
+        <w:rPr>
+          <w:rFonts w:ascii="Segoe UI Emoji" w:hAnsi="Segoe UI Emoji" w:cs="Segoe UI Emoji"/>
+        </w:rPr>
+        <w:t>👋</w:t>
+      </w:r>
+    </w:p>
+    <w:p>
+      <w:r>
+        <w:t>On se retrouve ce soir en visioconférence pour une session capitale centrée sur le lancement du Projet Professionnel ! Au programme de notre rendez-vous, nous allons décortiquer ensemble les différents sujets proposés pour ce Projet Pro, expliciter clairement les attentes pédagogiques et poser les bases méthodologiques pour que chacun démarre du bon pied. Pour celles et ceux qui ont déjà pu accéder à la plateforme et entamer leurs réflexions, j'espère que tout se passe au mieux ; cette soirée vous permettra d'y voir encore plus clair et de préciser votre orientation.</w:t>
+      </w:r>
+    </w:p>
+    <w:p>
+      <w:r>
+        <w:t xml:space="preserve">Je tiens également à rassurer toutes les personnes qui travaillent encore sur les Séquences </w:t>
+      </w:r>
+      <w:r>
+        <w:t>1-5</w:t>
+      </w:r>
+      <w:r>
+        <w:t xml:space="preserve"> : ne perdez surtout pas espoir et gardez votre rythme ! Je continue à lire, corriger et valider vos devoirs quotidiennement sur Moodle. Rien n'est fermé, vous êtes toujours dans la course, alors poursuivez vos efforts pour finaliser vos derniers modules au plus vite.</w:t>
+      </w:r>
+    </w:p>
+    <w:p>
+      <w:r>
+        <w:t xml:space="preserve">N'hésitez pas à faire vivre notre groupe WhatsApp pour poser vos questions, échanger sur vos blocages et vous soutenir mutuellement. Préparez vos questions pour ce soir et retrouvons-nous nombreux tout à l'heure en direct ! </w:t>
+      </w:r>
+    </w:p>
+    <w:p/>
     <w:p/>
     <w:p/>
     <w:sectPr>

</xml_diff>